<commit_message>
Added little things and feature logic
</commit_message>
<xml_diff>
--- a/Documentation Individual/Exploratory research.docx
+++ b/Documentation Individual/Exploratory research.docx
@@ -627,6 +627,21 @@
           <w:sz w:val="24"/>
           <w:szCs w:val="24"/>
         </w:rPr>
+        <w:t>I think the C4 model website given on Canvas is really the best to understand the C4 model. A great source of information!</w:t>
+      </w:r>
+    </w:p>
+    <w:p>
+      <w:pPr>
+        <w:rPr>
+          <w:sz w:val="24"/>
+          <w:szCs w:val="24"/>
+        </w:rPr>
+      </w:pPr>
+      <w:r>
+        <w:rPr>
+          <w:sz w:val="24"/>
+          <w:szCs w:val="24"/>
+        </w:rPr>
         <w:br w:type="page"/>
       </w:r>
     </w:p>
@@ -691,6 +706,21 @@
         </w:rPr>
         <w:t xml:space="preserve"> tested. </w:t>
       </w:r>
+      <w:r>
+        <w:rPr>
+          <w:sz w:val="24"/>
+          <w:szCs w:val="24"/>
+        </w:rPr>
+        <w:br/>
+      </w:r>
+      <w:r>
+        <w:rPr>
+          <w:sz w:val="24"/>
+          <w:szCs w:val="24"/>
+        </w:rPr>
+        <w:br/>
+        <w:t>Moq is an amazing tool. I used Nick Chapsas and more to finally understand what the purpose of this tool is. In a small paragraph my understanding is that it pretends to be an interface to create fake data or fake results with my actual existing methods. This way I avoid making extra interfaces to pass into the tests – I just declare it. I even simulate the dependency injection if I am not incorrect! However I still tried to make a fake user repo the normal way just to get a feel of what is really is like. All in all it is a great tool.</w:t>
+      </w:r>
     </w:p>
     <w:p>
       <w:pPr>
@@ -768,8 +798,6 @@
     <w:p>
       <w:pPr>
         <w:rPr>
-          <w:b/>
-          <w:bCs/>
           <w:sz w:val="24"/>
           <w:szCs w:val="24"/>
         </w:rPr>
@@ -781,6 +809,660 @@
         </w:rPr>
         <w:t>Just watch the videos and take in the whole explanation. I think it is VERY helpful.</w:t>
       </w:r>
+    </w:p>
+    <w:p>
+      <w:pPr>
+        <w:rPr>
+          <w:b/>
+          <w:bCs/>
+          <w:sz w:val="24"/>
+          <w:szCs w:val="24"/>
+        </w:rPr>
+      </w:pPr>
+    </w:p>
+    <w:p>
+      <w:pPr>
+        <w:rPr>
+          <w:b/>
+          <w:bCs/>
+          <w:sz w:val="24"/>
+          <w:szCs w:val="24"/>
+        </w:rPr>
+      </w:pPr>
+      <w:r>
+        <w:rPr>
+          <w:b/>
+          <w:bCs/>
+          <w:sz w:val="24"/>
+          <w:szCs w:val="24"/>
+        </w:rPr>
+        <w:br w:type="page"/>
+      </w:r>
+    </w:p>
+    <w:p>
+      <w:pPr>
+        <w:rPr>
+          <w:b/>
+          <w:bCs/>
+          <w:sz w:val="24"/>
+          <w:szCs w:val="24"/>
+        </w:rPr>
+      </w:pPr>
+      <w:r>
+        <w:rPr>
+          <w:b/>
+          <w:bCs/>
+          <w:sz w:val="24"/>
+          <w:szCs w:val="24"/>
+        </w:rPr>
+        <w:lastRenderedPageBreak/>
+        <w:t>References</w:t>
+      </w:r>
+      <w:r>
+        <w:rPr>
+          <w:b/>
+          <w:bCs/>
+          <w:sz w:val="24"/>
+          <w:szCs w:val="24"/>
+        </w:rPr>
+        <w:t>(The good Ones)</w:t>
+      </w:r>
+      <w:r>
+        <w:rPr>
+          <w:b/>
+          <w:bCs/>
+          <w:sz w:val="24"/>
+          <w:szCs w:val="24"/>
+        </w:rPr>
+        <w:t>:</w:t>
+      </w:r>
+    </w:p>
+    <w:p>
+      <w:pPr>
+        <w:rPr>
+          <w:b/>
+          <w:bCs/>
+          <w:sz w:val="24"/>
+          <w:szCs w:val="24"/>
+        </w:rPr>
+      </w:pPr>
+      <w:r>
+        <w:rPr>
+          <w:b/>
+          <w:bCs/>
+          <w:sz w:val="24"/>
+          <w:szCs w:val="24"/>
+        </w:rPr>
+        <w:t xml:space="preserve">Codewrinkles. (2021, October 18). </w:t>
+      </w:r>
+      <w:r>
+        <w:rPr>
+          <w:b/>
+          <w:bCs/>
+          <w:i/>
+          <w:iCs/>
+          <w:sz w:val="24"/>
+          <w:szCs w:val="24"/>
+        </w:rPr>
+        <w:t>How to structure a layered architecture ASP.Net Core project in a (almost) clean way</w:t>
+      </w:r>
+      <w:r>
+        <w:rPr>
+          <w:b/>
+          <w:bCs/>
+          <w:sz w:val="24"/>
+          <w:szCs w:val="24"/>
+        </w:rPr>
+        <w:t xml:space="preserve"> [Video]. YouTube. </w:t>
+      </w:r>
+      <w:hyperlink r:id="rId14" w:history="1">
+        <w:r>
+          <w:rPr>
+            <w:rStyle w:val="Hyperlink"/>
+            <w:b/>
+            <w:bCs/>
+            <w:sz w:val="24"/>
+            <w:szCs w:val="24"/>
+          </w:rPr>
+          <w:t>https://www.youtube.com/watch?v=S86Y0sxXhDE</w:t>
+        </w:r>
+      </w:hyperlink>
+    </w:p>
+    <w:p>
+      <w:pPr>
+        <w:rPr>
+          <w:b/>
+          <w:bCs/>
+          <w:sz w:val="24"/>
+          <w:szCs w:val="24"/>
+        </w:rPr>
+      </w:pPr>
+    </w:p>
+    <w:p>
+      <w:pPr>
+        <w:rPr>
+          <w:b/>
+          <w:bCs/>
+          <w:sz w:val="24"/>
+          <w:szCs w:val="24"/>
+        </w:rPr>
+      </w:pPr>
+      <w:r>
+        <w:rPr>
+          <w:b/>
+          <w:bCs/>
+          <w:sz w:val="24"/>
+          <w:szCs w:val="24"/>
+        </w:rPr>
+        <w:t>Shershnev, S. (2023, May 1). Layered architecture implementation in Golang - Sergey Shershnev - Medium. </w:t>
+      </w:r>
+      <w:r>
+        <w:rPr>
+          <w:b/>
+          <w:bCs/>
+          <w:i/>
+          <w:iCs/>
+          <w:sz w:val="24"/>
+          <w:szCs w:val="24"/>
+        </w:rPr>
+        <w:t>Medium</w:t>
+      </w:r>
+      <w:r>
+        <w:rPr>
+          <w:b/>
+          <w:bCs/>
+          <w:sz w:val="24"/>
+          <w:szCs w:val="24"/>
+        </w:rPr>
+        <w:t>. </w:t>
+      </w:r>
+      <w:hyperlink r:id="rId15" w:history="1">
+        <w:r>
+          <w:rPr>
+            <w:rStyle w:val="Hyperlink"/>
+            <w:b/>
+            <w:bCs/>
+            <w:sz w:val="24"/>
+            <w:szCs w:val="24"/>
+          </w:rPr>
+          <w:t>https://medium.com/@shershnev/layered-architecture-implementation-in-golang-6318a72c1e10</w:t>
+        </w:r>
+      </w:hyperlink>
+    </w:p>
+    <w:p>
+      <w:pPr>
+        <w:rPr>
+          <w:b/>
+          <w:bCs/>
+          <w:sz w:val="24"/>
+          <w:szCs w:val="24"/>
+        </w:rPr>
+      </w:pPr>
+    </w:p>
+    <w:p>
+      <w:pPr>
+        <w:rPr>
+          <w:b/>
+          <w:bCs/>
+          <w:sz w:val="24"/>
+          <w:szCs w:val="24"/>
+        </w:rPr>
+      </w:pPr>
+      <w:r>
+        <w:rPr>
+          <w:b/>
+          <w:bCs/>
+          <w:sz w:val="24"/>
+          <w:szCs w:val="24"/>
+        </w:rPr>
+        <w:t xml:space="preserve">Patrick God. (2022, November 15). </w:t>
+      </w:r>
+      <w:r>
+        <w:rPr>
+          <w:b/>
+          <w:bCs/>
+          <w:i/>
+          <w:iCs/>
+          <w:sz w:val="24"/>
+          <w:szCs w:val="24"/>
+        </w:rPr>
+        <w:t xml:space="preserve">The Repository Pattern explained for EVERYONE (with Code Examples) </w:t>
+      </w:r>
+      <w:r>
+        <w:rPr>
+          <w:rFonts w:ascii="Segoe UI Emoji" w:hAnsi="Segoe UI Emoji" w:cs="Segoe UI Emoji"/>
+          <w:b/>
+          <w:bCs/>
+          <w:i/>
+          <w:iCs/>
+          <w:sz w:val="24"/>
+          <w:szCs w:val="24"/>
+        </w:rPr>
+        <w:t>🚀</w:t>
+      </w:r>
+      <w:r>
+        <w:rPr>
+          <w:b/>
+          <w:bCs/>
+          <w:sz w:val="24"/>
+          <w:szCs w:val="24"/>
+        </w:rPr>
+        <w:t xml:space="preserve"> [Video]. YouTube. </w:t>
+      </w:r>
+      <w:hyperlink r:id="rId16" w:history="1">
+        <w:r>
+          <w:rPr>
+            <w:rStyle w:val="Hyperlink"/>
+            <w:b/>
+            <w:bCs/>
+            <w:sz w:val="24"/>
+            <w:szCs w:val="24"/>
+          </w:rPr>
+          <w:t>https://www.youtube.com/watch?v=Wiy54682d1w</w:t>
+        </w:r>
+      </w:hyperlink>
+    </w:p>
+    <w:p>
+      <w:pPr>
+        <w:rPr>
+          <w:b/>
+          <w:bCs/>
+          <w:sz w:val="24"/>
+          <w:szCs w:val="24"/>
+        </w:rPr>
+      </w:pPr>
+    </w:p>
+    <w:p>
+      <w:pPr>
+        <w:rPr>
+          <w:b/>
+          <w:bCs/>
+          <w:sz w:val="24"/>
+          <w:szCs w:val="24"/>
+          <w:lang w:val="pt-PT"/>
+        </w:rPr>
+      </w:pPr>
+      <w:r>
+        <w:rPr>
+          <w:b/>
+          <w:bCs/>
+          <w:sz w:val="24"/>
+          <w:szCs w:val="24"/>
+        </w:rPr>
+        <w:t xml:space="preserve">Amichai Mantinband. (2023, September 28). </w:t>
+      </w:r>
+      <w:r>
+        <w:rPr>
+          <w:b/>
+          <w:bCs/>
+          <w:i/>
+          <w:iCs/>
+          <w:sz w:val="24"/>
+          <w:szCs w:val="24"/>
+        </w:rPr>
+        <w:t>Understand clean architecture in 7 minutes</w:t>
+      </w:r>
+      <w:r>
+        <w:rPr>
+          <w:b/>
+          <w:bCs/>
+          <w:sz w:val="24"/>
+          <w:szCs w:val="24"/>
+        </w:rPr>
+        <w:t xml:space="preserve"> [Video]. </w:t>
+      </w:r>
+      <w:r>
+        <w:rPr>
+          <w:b/>
+          <w:bCs/>
+          <w:sz w:val="24"/>
+          <w:szCs w:val="24"/>
+          <w:lang w:val="pt-PT"/>
+        </w:rPr>
+        <w:t xml:space="preserve">YouTube. </w:t>
+      </w:r>
+      <w:hyperlink r:id="rId17" w:history="1">
+        <w:r>
+          <w:rPr>
+            <w:rStyle w:val="Hyperlink"/>
+            <w:b/>
+            <w:bCs/>
+            <w:sz w:val="24"/>
+            <w:szCs w:val="24"/>
+            <w:lang w:val="pt-PT"/>
+          </w:rPr>
+          <w:t>https://www.youtube.com/watch?v=1</w:t>
+        </w:r>
+        <w:r>
+          <w:rPr>
+            <w:rStyle w:val="Hyperlink"/>
+            <w:b/>
+            <w:bCs/>
+            <w:sz w:val="24"/>
+            <w:szCs w:val="24"/>
+            <w:lang w:val="pt-PT"/>
+          </w:rPr>
+          <w:t>O</w:t>
+        </w:r>
+        <w:r>
+          <w:rPr>
+            <w:rStyle w:val="Hyperlink"/>
+            <w:b/>
+            <w:bCs/>
+            <w:sz w:val="24"/>
+            <w:szCs w:val="24"/>
+            <w:lang w:val="pt-PT"/>
+          </w:rPr>
+          <w:t>LSE</w:t>
+        </w:r>
+        <w:r>
+          <w:rPr>
+            <w:rStyle w:val="Hyperlink"/>
+            <w:b/>
+            <w:bCs/>
+            <w:sz w:val="24"/>
+            <w:szCs w:val="24"/>
+            <w:lang w:val="pt-PT"/>
+          </w:rPr>
+          <w:t>6</w:t>
+        </w:r>
+        <w:r>
+          <w:rPr>
+            <w:rStyle w:val="Hyperlink"/>
+            <w:b/>
+            <w:bCs/>
+            <w:sz w:val="24"/>
+            <w:szCs w:val="24"/>
+            <w:lang w:val="pt-PT"/>
+          </w:rPr>
+          <w:t>tX71Y</w:t>
+        </w:r>
+      </w:hyperlink>
+    </w:p>
+    <w:p>
+      <w:pPr>
+        <w:rPr>
+          <w:b/>
+          <w:bCs/>
+          <w:sz w:val="24"/>
+          <w:szCs w:val="24"/>
+          <w:lang w:val="pt-PT"/>
+        </w:rPr>
+      </w:pPr>
+    </w:p>
+    <w:p>
+      <w:pPr>
+        <w:rPr>
+          <w:b/>
+          <w:bCs/>
+          <w:sz w:val="24"/>
+          <w:szCs w:val="24"/>
+        </w:rPr>
+      </w:pPr>
+      <w:r>
+        <w:rPr>
+          <w:b/>
+          <w:bCs/>
+          <w:sz w:val="24"/>
+          <w:szCs w:val="24"/>
+          <w:lang w:val="pt-PT"/>
+        </w:rPr>
+        <w:t>Milan Jovanovi</w:t>
+      </w:r>
+      <w:r>
+        <w:rPr>
+          <w:rFonts w:ascii="Cambria" w:hAnsi="Cambria" w:cs="Cambria"/>
+          <w:b/>
+          <w:bCs/>
+          <w:sz w:val="24"/>
+          <w:szCs w:val="24"/>
+          <w:lang w:val="pt-PT"/>
+        </w:rPr>
+        <w:t>ć</w:t>
+      </w:r>
+      <w:r>
+        <w:rPr>
+          <w:b/>
+          <w:bCs/>
+          <w:sz w:val="24"/>
+          <w:szCs w:val="24"/>
+          <w:lang w:val="pt-PT"/>
+        </w:rPr>
+        <w:t xml:space="preserve">. </w:t>
+      </w:r>
+      <w:r>
+        <w:rPr>
+          <w:b/>
+          <w:bCs/>
+          <w:sz w:val="24"/>
+          <w:szCs w:val="24"/>
+        </w:rPr>
+        <w:t xml:space="preserve">(2024, April 23). </w:t>
+      </w:r>
+      <w:r>
+        <w:rPr>
+          <w:b/>
+          <w:bCs/>
+          <w:i/>
+          <w:iCs/>
+          <w:sz w:val="24"/>
+          <w:szCs w:val="24"/>
+        </w:rPr>
+        <w:t>The Beginner’s Guide to Clean architecture</w:t>
+      </w:r>
+      <w:r>
+        <w:rPr>
+          <w:b/>
+          <w:bCs/>
+          <w:sz w:val="24"/>
+          <w:szCs w:val="24"/>
+        </w:rPr>
+        <w:t xml:space="preserve"> [Video]. YouTube. </w:t>
+      </w:r>
+      <w:hyperlink r:id="rId18" w:history="1">
+        <w:r>
+          <w:rPr>
+            <w:rStyle w:val="Hyperlink"/>
+            <w:b/>
+            <w:bCs/>
+            <w:sz w:val="24"/>
+            <w:szCs w:val="24"/>
+          </w:rPr>
+          <w:t>https://www.youtube.com/watch?v=TQdLgzVk2T8</w:t>
+        </w:r>
+      </w:hyperlink>
+    </w:p>
+    <w:p>
+      <w:pPr>
+        <w:rPr>
+          <w:b/>
+          <w:bCs/>
+          <w:sz w:val="24"/>
+          <w:szCs w:val="24"/>
+        </w:rPr>
+      </w:pPr>
+    </w:p>
+    <w:p>
+      <w:pPr>
+        <w:rPr>
+          <w:b/>
+          <w:bCs/>
+          <w:sz w:val="24"/>
+          <w:szCs w:val="24"/>
+        </w:rPr>
+      </w:pPr>
+      <w:r>
+        <w:rPr>
+          <w:b/>
+          <w:bCs/>
+          <w:sz w:val="24"/>
+          <w:szCs w:val="24"/>
+        </w:rPr>
+        <w:t xml:space="preserve">Nick Chapsas. (2020, January 27). </w:t>
+      </w:r>
+      <w:r>
+        <w:rPr>
+          <w:b/>
+          <w:bCs/>
+          <w:i/>
+          <w:iCs/>
+          <w:sz w:val="24"/>
+          <w:szCs w:val="24"/>
+        </w:rPr>
+        <w:t>Getting started with Mocking using Moq in .NET (Core, Framework, Standard)</w:t>
+      </w:r>
+      <w:r>
+        <w:rPr>
+          <w:b/>
+          <w:bCs/>
+          <w:sz w:val="24"/>
+          <w:szCs w:val="24"/>
+        </w:rPr>
+        <w:t xml:space="preserve"> [Video]. YouTube. </w:t>
+      </w:r>
+      <w:hyperlink r:id="rId19" w:history="1">
+        <w:r>
+          <w:rPr>
+            <w:rStyle w:val="Hyperlink"/>
+            <w:b/>
+            <w:bCs/>
+            <w:sz w:val="24"/>
+            <w:szCs w:val="24"/>
+          </w:rPr>
+          <w:t>https://www.youtube.com/watch?v=9ZvDBSQa_so</w:t>
+        </w:r>
+      </w:hyperlink>
+    </w:p>
+    <w:p>
+      <w:pPr>
+        <w:rPr>
+          <w:b/>
+          <w:bCs/>
+          <w:sz w:val="24"/>
+          <w:szCs w:val="24"/>
+        </w:rPr>
+      </w:pPr>
+    </w:p>
+    <w:p>
+      <w:pPr>
+        <w:rPr>
+          <w:b/>
+          <w:bCs/>
+          <w:sz w:val="24"/>
+          <w:szCs w:val="24"/>
+        </w:rPr>
+      </w:pPr>
+      <w:r>
+        <w:rPr>
+          <w:b/>
+          <w:bCs/>
+          <w:sz w:val="24"/>
+          <w:szCs w:val="24"/>
+          <w:lang w:val="pt-PT"/>
+        </w:rPr>
+        <w:t xml:space="preserve">Frank Liu. </w:t>
+      </w:r>
+      <w:r>
+        <w:rPr>
+          <w:b/>
+          <w:bCs/>
+          <w:sz w:val="24"/>
+          <w:szCs w:val="24"/>
+        </w:rPr>
+        <w:t xml:space="preserve">(2021, May 2). </w:t>
+      </w:r>
+      <w:r>
+        <w:rPr>
+          <w:b/>
+          <w:bCs/>
+          <w:i/>
+          <w:iCs/>
+          <w:sz w:val="24"/>
+          <w:szCs w:val="24"/>
+        </w:rPr>
+        <w:t>ClaimsPrincipal, ClaimsIdentity and Claim | ASP.NET CORE Identity &amp; Security Series | Episode #3</w:t>
+      </w:r>
+      <w:r>
+        <w:rPr>
+          <w:b/>
+          <w:bCs/>
+          <w:sz w:val="24"/>
+          <w:szCs w:val="24"/>
+        </w:rPr>
+        <w:t xml:space="preserve"> [Video]. YouTube. </w:t>
+      </w:r>
+      <w:hyperlink r:id="rId20" w:history="1">
+        <w:r>
+          <w:rPr>
+            <w:rStyle w:val="Hyperlink"/>
+            <w:b/>
+            <w:bCs/>
+            <w:sz w:val="24"/>
+            <w:szCs w:val="24"/>
+          </w:rPr>
+          <w:t>https://www.youtube.com/watch?v=3i0RcKrVyTo</w:t>
+        </w:r>
+      </w:hyperlink>
+    </w:p>
+    <w:p>
+      <w:pPr>
+        <w:rPr>
+          <w:b/>
+          <w:bCs/>
+          <w:sz w:val="24"/>
+          <w:szCs w:val="24"/>
+        </w:rPr>
+      </w:pPr>
+    </w:p>
+    <w:p>
+      <w:pPr>
+        <w:rPr>
+          <w:b/>
+          <w:bCs/>
+          <w:sz w:val="24"/>
+          <w:szCs w:val="24"/>
+        </w:rPr>
+      </w:pPr>
+      <w:r>
+        <w:rPr>
+          <w:b/>
+          <w:bCs/>
+          <w:sz w:val="24"/>
+          <w:szCs w:val="24"/>
+        </w:rPr>
+        <w:lastRenderedPageBreak/>
+        <w:t xml:space="preserve"> </w:t>
+      </w:r>
+    </w:p>
+    <w:p>
+      <w:pPr>
+        <w:rPr>
+          <w:b/>
+          <w:bCs/>
+          <w:sz w:val="24"/>
+          <w:szCs w:val="24"/>
+        </w:rPr>
+      </w:pPr>
+    </w:p>
+    <w:p>
+      <w:pPr>
+        <w:rPr>
+          <w:b/>
+          <w:bCs/>
+          <w:sz w:val="24"/>
+          <w:szCs w:val="24"/>
+        </w:rPr>
+      </w:pPr>
+    </w:p>
+    <w:p>
+      <w:pPr>
+        <w:rPr>
+          <w:b/>
+          <w:bCs/>
+          <w:sz w:val="24"/>
+          <w:szCs w:val="24"/>
+        </w:rPr>
+      </w:pPr>
     </w:p>
     <w:sectPr>
       <w:pgSz w:w="12240" w:h="15840"/>
@@ -1674,7 +2356,6 @@
   <w:style w:type="character" w:default="1" w:styleId="DefaultParagraphFont">
     <w:name w:val="Default Paragraph Font"/>
     <w:uiPriority w:val="1"/>
-    <w:semiHidden/>
     <w:unhideWhenUsed/>
   </w:style>
   <w:style w:type="table" w:default="1" w:styleId="TableNormal">

</xml_diff>